<commit_message>
add more report things
</commit_message>
<xml_diff>
--- a/РемКомСтрой_Этап_1.docx
+++ b/РемКомСтрой_Этап_1.docx
@@ -4,28 +4,22 @@
   <w:body>
     <w:p>
       <w:pPr>
-        <w:pStyle w:val="aa"/>
-        <w:spacing w:before="2520" w:after="360"/>
+        <w:spacing w:after="0"/>
+        <w:ind w:firstLine="0"/>
+        <w:jc w:val="center"/>
         <w:rPr>
           <w:lang w:val="ru-RU"/>
         </w:rPr>
       </w:pPr>
       <w:r>
         <w:rPr>
-          <w:rFonts w:ascii="Times New Roman" w:eastAsia="Times New Roman" w:hAnsi="Times New Roman"/>
-          <w:lang w:val="ru-RU"/>
-        </w:rPr>
-        <w:t xml:space="preserve">Информационная система </w:t>
-      </w:r>
-      <w:proofErr w:type="spellStart"/>
-      <w:r>
-        <w:rPr>
-          <w:rFonts w:ascii="Times New Roman" w:eastAsia="Times New Roman" w:hAnsi="Times New Roman"/>
-          <w:lang w:val="ru-RU"/>
-        </w:rPr>
-        <w:t>РемКомСтрой</w:t>
-      </w:r>
-      <w:proofErr w:type="spellEnd"/>
+          <w:rFonts w:cs="Times New Roman"/>
+          <w:b/>
+          <w:szCs w:val="24"/>
+          <w:lang w:val="ru-RU"/>
+        </w:rPr>
+        <w:t>МИНОБРНАУКИ РОССИИ</w:t>
+      </w:r>
     </w:p>
     <w:p>
       <w:pPr>
@@ -38,23 +32,17 @@
       </w:pPr>
       <w:r>
         <w:rPr>
-          <w:sz w:val="28"/>
-          <w:lang w:val="ru-RU"/>
-        </w:rPr>
-        <w:t>Этап 1. Описание предметной области, назначение системы, требования и</w:t>
-      </w:r>
-      <w:r>
-        <w:rPr>
-          <w:sz w:val="28"/>
-          <w:lang w:val="ru-RU"/>
-        </w:rPr>
-        <w:br/>
-        <w:t>основные прецеденты</w:t>
+          <w:rFonts w:cs="Times New Roman"/>
+          <w:b/>
+          <w:szCs w:val="24"/>
+          <w:lang w:val="ru-RU"/>
+        </w:rPr>
+        <w:t>ФЕДЕРАЛЬНОЕ ГОСУДАРСТВЕННОЕ АВТОНОМНОЕ</w:t>
       </w:r>
     </w:p>
     <w:p>
       <w:pPr>
-        <w:spacing w:before="3240" w:after="0"/>
+        <w:spacing w:after="0"/>
         <w:ind w:firstLine="0"/>
         <w:jc w:val="center"/>
         <w:rPr>
@@ -63,9 +51,497 @@
       </w:pPr>
       <w:r>
         <w:rPr>
-          <w:lang w:val="ru-RU"/>
-        </w:rPr>
-        <w:t>Курсовая работа по дисциплине «Информационные системы»</w:t>
+          <w:rFonts w:cs="Times New Roman"/>
+          <w:b/>
+          <w:szCs w:val="24"/>
+          <w:lang w:val="ru-RU"/>
+        </w:rPr>
+        <w:t>ОБРАЗОВАТЕЛЬНОЕ УЧРЕЖДЕНИЕ ВЫСШЕГО ОБРАЗОВАНИЯ</w:t>
+      </w:r>
+    </w:p>
+    <w:p>
+      <w:pPr>
+        <w:spacing w:after="0"/>
+        <w:ind w:firstLine="0"/>
+        <w:jc w:val="center"/>
+        <w:rPr>
+          <w:lang w:val="ru-RU"/>
+        </w:rPr>
+      </w:pPr>
+      <w:r>
+        <w:rPr>
+          <w:rFonts w:cs="Times New Roman"/>
+          <w:b/>
+          <w:szCs w:val="24"/>
+          <w:lang w:val="ru-RU"/>
+        </w:rPr>
+        <w:t>«НАЦИОНАЛЬНЫЙ ИССЛЕДОВАТЕЛЬСКИЙ</w:t>
+      </w:r>
+    </w:p>
+    <w:p>
+      <w:pPr>
+        <w:ind w:firstLine="0"/>
+        <w:jc w:val="center"/>
+        <w:rPr>
+          <w:lang w:val="ru-RU"/>
+        </w:rPr>
+      </w:pPr>
+      <w:r>
+        <w:rPr>
+          <w:rFonts w:cs="Times New Roman"/>
+          <w:b/>
+          <w:szCs w:val="24"/>
+          <w:lang w:val="ru-RU"/>
+        </w:rPr>
+        <w:t>УНИВЕРСИТЕТ ИТМО»</w:t>
+      </w:r>
+    </w:p>
+    <w:p>
+      <w:pPr>
+        <w:spacing w:after="0"/>
+        <w:ind w:firstLine="0"/>
+        <w:jc w:val="center"/>
+        <w:rPr>
+          <w:lang w:val="ru-RU"/>
+        </w:rPr>
+      </w:pPr>
+      <w:r>
+        <w:rPr>
+          <w:rFonts w:cs="Times New Roman"/>
+          <w:sz w:val="22"/>
+          <w:lang w:val="ru-RU"/>
+        </w:rPr>
+        <w:t>ФАКУЛЬТЕТ ПРОГРАММНОЙ ИНЖЕНЕРИИ</w:t>
+      </w:r>
+    </w:p>
+    <w:p>
+      <w:pPr>
+        <w:spacing w:after="0"/>
+        <w:ind w:firstLine="0"/>
+        <w:jc w:val="center"/>
+        <w:rPr>
+          <w:lang w:val="ru-RU"/>
+        </w:rPr>
+      </w:pPr>
+      <w:r>
+        <w:rPr>
+          <w:rFonts w:cs="Times New Roman"/>
+          <w:sz w:val="22"/>
+          <w:lang w:val="ru-RU"/>
+        </w:rPr>
+        <w:t>И КОМПЬЮТЕРНОЙ ТЕХНИКИ</w:t>
+      </w:r>
+    </w:p>
+    <w:p>
+      <w:pPr>
+        <w:spacing w:after="0"/>
+        <w:ind w:firstLine="0"/>
+        <w:jc w:val="center"/>
+        <w:rPr>
+          <w:lang w:val="ru-RU"/>
+        </w:rPr>
+      </w:pPr>
+      <w:r>
+        <w:rPr>
+          <w:rFonts w:cs="Times New Roman"/>
+          <w:sz w:val="22"/>
+          <w:lang w:val="ru-RU"/>
+        </w:rPr>
+        <w:t>МЕГАФАКУЛЬТЕТ КОМПЬЮТЕРНЫХ ТЕХНОЛОГИЙ И</w:t>
+      </w:r>
+    </w:p>
+    <w:p>
+      <w:pPr>
+        <w:spacing w:after="0"/>
+        <w:ind w:firstLine="0"/>
+        <w:jc w:val="center"/>
+        <w:rPr>
+          <w:lang w:val="ru-RU"/>
+        </w:rPr>
+      </w:pPr>
+      <w:r>
+        <w:rPr>
+          <w:rFonts w:cs="Times New Roman"/>
+          <w:sz w:val="22"/>
+          <w:lang w:val="ru-RU"/>
+        </w:rPr>
+        <w:t>УПРАВЛЕНИЯ</w:t>
+      </w:r>
+    </w:p>
+    <w:p>
+      <w:pPr>
+        <w:spacing w:before="600" w:after="0"/>
+        <w:ind w:firstLine="0"/>
+        <w:jc w:val="center"/>
+        <w:rPr>
+          <w:lang w:val="ru-RU"/>
+        </w:rPr>
+      </w:pPr>
+    </w:p>
+    <w:p>
+      <w:pPr>
+        <w:spacing w:after="0"/>
+        <w:ind w:firstLine="0"/>
+        <w:jc w:val="center"/>
+        <w:rPr>
+          <w:lang w:val="ru-RU"/>
+        </w:rPr>
+      </w:pPr>
+      <w:r>
+        <w:rPr>
+          <w:rFonts w:cs="Times New Roman"/>
+          <w:b/>
+          <w:sz w:val="32"/>
+          <w:szCs w:val="32"/>
+          <w:lang w:val="ru-RU"/>
+        </w:rPr>
+        <w:t>Создание информационной системы</w:t>
+      </w:r>
+    </w:p>
+    <w:p>
+      <w:pPr>
+        <w:spacing w:after="0"/>
+        <w:ind w:firstLine="0"/>
+        <w:jc w:val="center"/>
+        <w:rPr>
+          <w:lang w:val="ru-RU"/>
+        </w:rPr>
+      </w:pPr>
+      <w:r>
+        <w:rPr>
+          <w:rFonts w:cs="Times New Roman"/>
+          <w:b/>
+          <w:sz w:val="32"/>
+          <w:szCs w:val="32"/>
+          <w:lang w:val="ru-RU"/>
+        </w:rPr>
+        <w:t>для управления комплексным ремонтом</w:t>
+      </w:r>
+    </w:p>
+    <w:p>
+      <w:pPr>
+        <w:spacing w:after="0"/>
+        <w:ind w:firstLine="0"/>
+        <w:jc w:val="center"/>
+        <w:rPr>
+          <w:lang w:val="ru-RU"/>
+        </w:rPr>
+      </w:pPr>
+      <w:r>
+        <w:rPr>
+          <w:rFonts w:cs="Times New Roman"/>
+          <w:b/>
+          <w:sz w:val="32"/>
+          <w:szCs w:val="32"/>
+          <w:lang w:val="ru-RU"/>
+        </w:rPr>
+        <w:t>зданий и автомобильных дорог</w:t>
+      </w:r>
+    </w:p>
+    <w:p>
+      <w:pPr>
+        <w:spacing w:after="240"/>
+        <w:ind w:firstLine="0"/>
+        <w:jc w:val="center"/>
+        <w:rPr>
+          <w:lang w:val="ru-RU"/>
+        </w:rPr>
+      </w:pPr>
+      <w:r>
+        <w:rPr>
+          <w:rFonts w:cs="Times New Roman"/>
+          <w:b/>
+          <w:sz w:val="32"/>
+          <w:szCs w:val="32"/>
+          <w:lang w:val="ru-RU"/>
+        </w:rPr>
+        <w:t>«</w:t>
+      </w:r>
+      <w:proofErr w:type="spellStart"/>
+      <w:r>
+        <w:rPr>
+          <w:rFonts w:cs="Times New Roman"/>
+          <w:b/>
+          <w:sz w:val="32"/>
+          <w:szCs w:val="32"/>
+          <w:lang w:val="ru-RU"/>
+        </w:rPr>
+        <w:t>РемКомСтрой</w:t>
+      </w:r>
+      <w:proofErr w:type="spellEnd"/>
+      <w:r>
+        <w:rPr>
+          <w:rFonts w:cs="Times New Roman"/>
+          <w:b/>
+          <w:sz w:val="32"/>
+          <w:szCs w:val="32"/>
+          <w:lang w:val="ru-RU"/>
+        </w:rPr>
+        <w:t>»</w:t>
+      </w:r>
+    </w:p>
+    <w:p>
+      <w:pPr>
+        <w:ind w:firstLine="0"/>
+        <w:jc w:val="center"/>
+        <w:rPr>
+          <w:lang w:val="ru-RU"/>
+        </w:rPr>
+      </w:pPr>
+      <w:r>
+        <w:rPr>
+          <w:rFonts w:cs="Times New Roman"/>
+          <w:i/>
+          <w:sz w:val="26"/>
+          <w:szCs w:val="26"/>
+          <w:lang w:val="ru-RU"/>
+        </w:rPr>
+        <w:t>курсовая работа, этап №1</w:t>
+      </w:r>
+    </w:p>
+    <w:p>
+      <w:pPr>
+        <w:spacing w:after="0"/>
+        <w:ind w:firstLine="0"/>
+        <w:jc w:val="center"/>
+        <w:rPr>
+          <w:lang w:val="ru-RU"/>
+        </w:rPr>
+      </w:pPr>
+      <w:r>
+        <w:rPr>
+          <w:rFonts w:cs="Times New Roman"/>
+          <w:szCs w:val="24"/>
+          <w:lang w:val="ru-RU"/>
+        </w:rPr>
+        <w:t>по дисциплине «Информационные системы»</w:t>
+      </w:r>
+    </w:p>
+    <w:p>
+      <w:pPr>
+        <w:spacing w:after="0"/>
+        <w:ind w:firstLine="0"/>
+        <w:jc w:val="center"/>
+        <w:rPr>
+          <w:lang w:val="ru-RU"/>
+        </w:rPr>
+      </w:pPr>
+      <w:r>
+        <w:rPr>
+          <w:rFonts w:cs="Times New Roman"/>
+          <w:szCs w:val="24"/>
+          <w:lang w:val="ru-RU"/>
+        </w:rPr>
+        <w:t>направления бакалавриата 09.03.04 «Программная инженерия»,</w:t>
+      </w:r>
+    </w:p>
+    <w:p>
+      <w:pPr>
+        <w:spacing w:after="0"/>
+        <w:ind w:firstLine="0"/>
+        <w:jc w:val="center"/>
+        <w:rPr>
+          <w:lang w:val="ru-RU"/>
+        </w:rPr>
+      </w:pPr>
+      <w:r>
+        <w:rPr>
+          <w:rFonts w:cs="Times New Roman"/>
+          <w:szCs w:val="24"/>
+          <w:lang w:val="ru-RU"/>
+        </w:rPr>
+        <w:t>образовательное направление «Системное и прикладное</w:t>
+      </w:r>
+    </w:p>
+    <w:p>
+      <w:pPr>
+        <w:spacing w:after="0"/>
+        <w:ind w:firstLine="0"/>
+        <w:jc w:val="center"/>
+        <w:rPr>
+          <w:lang w:val="ru-RU"/>
+        </w:rPr>
+      </w:pPr>
+      <w:r>
+        <w:rPr>
+          <w:rFonts w:cs="Times New Roman"/>
+          <w:szCs w:val="24"/>
+          <w:lang w:val="ru-RU"/>
+        </w:rPr>
+        <w:t>программное обеспечение»</w:t>
+      </w:r>
+    </w:p>
+    <w:p>
+      <w:pPr>
+        <w:spacing w:before="800" w:after="0"/>
+        <w:ind w:firstLine="0"/>
+        <w:jc w:val="center"/>
+        <w:rPr>
+          <w:lang w:val="ru-RU"/>
+        </w:rPr>
+      </w:pPr>
+    </w:p>
+    <w:p>
+      <w:pPr>
+        <w:spacing w:after="0"/>
+        <w:ind w:firstLine="0"/>
+        <w:jc w:val="right"/>
+        <w:rPr>
+          <w:lang w:val="ru-RU"/>
+        </w:rPr>
+      </w:pPr>
+      <w:r>
+        <w:rPr>
+          <w:rFonts w:cs="Times New Roman"/>
+          <w:szCs w:val="24"/>
+          <w:lang w:val="ru-RU"/>
+        </w:rPr>
+        <w:t>Научный руководитель:</w:t>
+      </w:r>
+    </w:p>
+    <w:p>
+      <w:pPr>
+        <w:spacing w:after="240"/>
+        <w:ind w:firstLine="0"/>
+        <w:jc w:val="right"/>
+        <w:rPr>
+          <w:lang w:val="ru-RU"/>
+        </w:rPr>
+      </w:pPr>
+      <w:r>
+        <w:rPr>
+          <w:rFonts w:cs="Times New Roman"/>
+          <w:szCs w:val="24"/>
+          <w:lang w:val="ru-RU"/>
+        </w:rPr>
+        <w:t>Николаев Владимир Вячеславович</w:t>
+      </w:r>
+    </w:p>
+    <w:p>
+      <w:pPr>
+        <w:spacing w:after="0"/>
+        <w:ind w:firstLine="0"/>
+        <w:jc w:val="right"/>
+        <w:rPr>
+          <w:lang w:val="ru-RU"/>
+        </w:rPr>
+      </w:pPr>
+      <w:r>
+        <w:rPr>
+          <w:rFonts w:cs="Times New Roman"/>
+          <w:szCs w:val="24"/>
+          <w:lang w:val="ru-RU"/>
+        </w:rPr>
+        <w:t>Работу выполнил:</w:t>
+      </w:r>
+    </w:p>
+    <w:p>
+      <w:pPr>
+        <w:spacing w:after="0"/>
+        <w:ind w:firstLine="0"/>
+        <w:jc w:val="right"/>
+        <w:rPr>
+          <w:rFonts w:cs="Times New Roman"/>
+          <w:szCs w:val="24"/>
+          <w:lang w:val="ru-RU"/>
+        </w:rPr>
+      </w:pPr>
+      <w:r>
+        <w:rPr>
+          <w:rFonts w:cs="Times New Roman"/>
+          <w:szCs w:val="24"/>
+          <w:lang w:val="ru-RU"/>
+        </w:rPr>
+        <w:t>Студент 3 курса</w:t>
+      </w:r>
+      <w:r>
+        <w:rPr>
+          <w:rFonts w:cs="Times New Roman"/>
+          <w:szCs w:val="24"/>
+          <w:lang w:val="ru-RU"/>
+        </w:rPr>
+        <w:t xml:space="preserve"> </w:t>
+      </w:r>
+      <w:r>
+        <w:rPr>
+          <w:rFonts w:cs="Times New Roman"/>
+          <w:szCs w:val="24"/>
+        </w:rPr>
+        <w:t>P</w:t>
+      </w:r>
+      <w:r>
+        <w:rPr>
+          <w:rFonts w:cs="Times New Roman"/>
+          <w:szCs w:val="24"/>
+          <w:lang w:val="ru-RU"/>
+        </w:rPr>
+        <w:t>3309</w:t>
+      </w:r>
+    </w:p>
+    <w:p>
+      <w:pPr>
+        <w:spacing w:after="0"/>
+        <w:ind w:firstLine="0"/>
+        <w:jc w:val="right"/>
+        <w:rPr>
+          <w:rFonts w:cs="Times New Roman"/>
+          <w:szCs w:val="24"/>
+          <w:lang w:val="ru-RU"/>
+        </w:rPr>
+      </w:pPr>
+      <w:r>
+        <w:rPr>
+          <w:rFonts w:cs="Times New Roman"/>
+          <w:szCs w:val="24"/>
+          <w:lang w:val="ru-RU"/>
+        </w:rPr>
+        <w:t>Кузьмин Дмитрий</w:t>
+      </w:r>
+    </w:p>
+    <w:p>
+      <w:pPr>
+        <w:spacing w:after="0"/>
+        <w:ind w:firstLine="0"/>
+        <w:jc w:val="right"/>
+        <w:rPr>
+          <w:lang w:val="ru-RU"/>
+        </w:rPr>
+      </w:pPr>
+      <w:r>
+        <w:rPr>
+          <w:rFonts w:cs="Times New Roman"/>
+          <w:szCs w:val="24"/>
+          <w:lang w:val="ru-RU"/>
+        </w:rPr>
+        <w:t>Калакин Ярослав</w:t>
+      </w:r>
+    </w:p>
+    <w:p>
+      <w:pPr>
+        <w:spacing w:before="1200" w:after="0"/>
+        <w:ind w:firstLine="0"/>
+        <w:jc w:val="center"/>
+        <w:rPr>
+          <w:lang w:val="ru-RU"/>
+        </w:rPr>
+      </w:pPr>
+    </w:p>
+    <w:p>
+      <w:pPr>
+        <w:spacing w:after="0"/>
+        <w:ind w:firstLine="0"/>
+        <w:jc w:val="center"/>
+        <w:rPr>
+          <w:lang w:val="ru-RU"/>
+        </w:rPr>
+      </w:pPr>
+      <w:r>
+        <w:rPr>
+          <w:rFonts w:cs="Times New Roman"/>
+          <w:szCs w:val="24"/>
+          <w:lang w:val="ru-RU"/>
+        </w:rPr>
+        <w:t>г. Санкт-Петербург – 2026</w:t>
       </w:r>
     </w:p>
     <w:p>
@@ -3768,11 +4244,12 @@
       </w:pPr>
       <w:r>
         <w:rPr>
+          <w:noProof/>
           <w:lang w:val="ru-RU"/>
         </w:rPr>
         <w:lastRenderedPageBreak/>
         <w:drawing>
-          <wp:inline distT="0" distB="0" distL="0" distR="0" wp14:anchorId="6E0CC4C3" wp14:editId="126C7C12">
+          <wp:inline distT="0" distB="0" distL="0" distR="0" wp14:anchorId="6B9F0F80" wp14:editId="5022A11A">
             <wp:extent cx="6309360" cy="2766060"/>
             <wp:effectExtent l="0" t="0" r="2540" b="2540"/>
             <wp:docPr id="954724305" name="Рисунок 1"/>
@@ -3809,10 +4286,11 @@
       </w:r>
       <w:r>
         <w:rPr>
+          <w:noProof/>
           <w:lang w:val="ru-RU"/>
         </w:rPr>
         <w:drawing>
-          <wp:inline distT="0" distB="0" distL="0" distR="0" wp14:anchorId="01ED1686" wp14:editId="034A1ABD">
+          <wp:inline distT="0" distB="0" distL="0" distR="0" wp14:anchorId="5B8B492C" wp14:editId="0982F7F3">
             <wp:extent cx="6309360" cy="4264660"/>
             <wp:effectExtent l="0" t="0" r="2540" b="2540"/>
             <wp:docPr id="1475240888" name="Рисунок 1"/>
@@ -3849,11 +4327,12 @@
       </w:r>
       <w:r>
         <w:rPr>
+          <w:noProof/>
           <w:lang w:val="ru-RU"/>
         </w:rPr>
         <w:lastRenderedPageBreak/>
         <w:drawing>
-          <wp:inline distT="0" distB="0" distL="0" distR="0" wp14:anchorId="27146969" wp14:editId="13AA8DDD">
+          <wp:inline distT="0" distB="0" distL="0" distR="0" wp14:anchorId="006EEC63" wp14:editId="3A6F53E7">
             <wp:extent cx="6309360" cy="3698240"/>
             <wp:effectExtent l="0" t="0" r="2540" b="0"/>
             <wp:docPr id="4636149" name="Рисунок 1"/>
@@ -11379,7 +11858,21 @@
               <w:rPr>
                 <w:sz w:val="22"/>
               </w:rPr>
-              <w:t xml:space="preserve">: Зафиксировать </w:t>
+              <w:t xml:space="preserve">: </w:t>
+            </w:r>
+            <w:proofErr w:type="spellStart"/>
+            <w:r>
+              <w:rPr>
+                <w:sz w:val="22"/>
+              </w:rPr>
+              <w:t>Зафиксировать</w:t>
+            </w:r>
+            <w:proofErr w:type="spellEnd"/>
+            <w:r>
+              <w:rPr>
+                <w:sz w:val="22"/>
+              </w:rPr>
+              <w:t xml:space="preserve"> </w:t>
             </w:r>
             <w:proofErr w:type="spellStart"/>
             <w:r>
@@ -18490,6 +18983,734 @@
         </w:tc>
       </w:tr>
     </w:tbl>
+    <w:p>
+      <w:pPr>
+        <w:pStyle w:val="1"/>
+        <w:rPr>
+          <w:lang w:val="ru-RU"/>
+        </w:rPr>
+      </w:pPr>
+      <w:r>
+        <w:rPr>
+          <w:lang w:val="ru-RU"/>
+        </w:rPr>
+        <w:t>6. АРХИТЕКТУРА БУДУЩЕЙ СИСТЕМЫ</w:t>
+      </w:r>
+    </w:p>
+    <w:p>
+      <w:pPr>
+        <w:rPr>
+          <w:lang w:val="ru-RU"/>
+        </w:rPr>
+      </w:pPr>
+      <w:r>
+        <w:rPr>
+          <w:lang w:val="ru-RU"/>
+        </w:rPr>
+        <w:t xml:space="preserve">Используемые технологии и фреймворки согласуются с преподавателем. Все этапы курсовой работы демонстрируются на сервере </w:t>
+      </w:r>
+      <w:proofErr w:type="spellStart"/>
+      <w:r>
+        <w:rPr>
+          <w:lang w:val="ru-RU"/>
+        </w:rPr>
+        <w:t>helios</w:t>
+      </w:r>
+      <w:proofErr w:type="spellEnd"/>
+      <w:r>
+        <w:rPr>
+          <w:lang w:val="ru-RU"/>
+        </w:rPr>
+        <w:t>.</w:t>
+      </w:r>
+    </w:p>
+    <w:p>
+      <w:pPr>
+        <w:rPr>
+          <w:lang w:val="ru-RU"/>
+        </w:rPr>
+      </w:pPr>
+      <w:r>
+        <w:rPr>
+          <w:b/>
+          <w:lang w:val="ru-RU"/>
+        </w:rPr>
+        <w:t>Архитектура</w:t>
+      </w:r>
+      <w:proofErr w:type="gramStart"/>
+      <w:r>
+        <w:rPr>
+          <w:b/>
+          <w:lang w:val="ru-RU"/>
+        </w:rPr>
+        <w:t>:</w:t>
+      </w:r>
+      <w:r>
+        <w:rPr>
+          <w:lang w:val="ru-RU"/>
+        </w:rPr>
+        <w:t xml:space="preserve"> Для</w:t>
+      </w:r>
+      <w:proofErr w:type="gramEnd"/>
+      <w:r>
+        <w:rPr>
+          <w:lang w:val="ru-RU"/>
+        </w:rPr>
+        <w:t xml:space="preserve"> построения информационной системы «</w:t>
+      </w:r>
+      <w:proofErr w:type="spellStart"/>
+      <w:r>
+        <w:rPr>
+          <w:lang w:val="ru-RU"/>
+        </w:rPr>
+        <w:t>РемКомСтрой</w:t>
+      </w:r>
+      <w:proofErr w:type="spellEnd"/>
+      <w:r>
+        <w:rPr>
+          <w:lang w:val="ru-RU"/>
+        </w:rPr>
+        <w:t>» используется многоуровневая (многослойная) архитектура, которая состоит из нескольких взаимосвязанных компонентов. Такое разделение позволяет каждому слою выполнять свои задачи и независимо развивать интерфейс, прикладную логику и базу данных.</w:t>
+      </w:r>
+    </w:p>
+    <w:p>
+      <w:pPr>
+        <w:pStyle w:val="21"/>
+        <w:rPr>
+          <w:lang w:val="ru-RU"/>
+        </w:rPr>
+      </w:pPr>
+      <w:r>
+        <w:rPr>
+          <w:lang w:val="ru-RU"/>
+        </w:rPr>
+        <w:t>Клиент-серверная архитектура</w:t>
+      </w:r>
+    </w:p>
+    <w:p>
+      <w:pPr>
+        <w:rPr>
+          <w:lang w:val="ru-RU"/>
+        </w:rPr>
+      </w:pPr>
+      <w:r>
+        <w:rPr>
+          <w:lang w:val="ru-RU"/>
+        </w:rPr>
+        <w:t>«</w:t>
+      </w:r>
+      <w:proofErr w:type="spellStart"/>
+      <w:r>
+        <w:rPr>
+          <w:lang w:val="ru-RU"/>
+        </w:rPr>
+        <w:t>РемКомСтрой</w:t>
+      </w:r>
+      <w:proofErr w:type="spellEnd"/>
+      <w:r>
+        <w:rPr>
+          <w:lang w:val="ru-RU"/>
+        </w:rPr>
+        <w:t xml:space="preserve">» основан на клиент-серверной архитектуре, где </w:t>
+      </w:r>
+      <w:proofErr w:type="spellStart"/>
+      <w:r>
+        <w:rPr>
+          <w:lang w:val="ru-RU"/>
+        </w:rPr>
+        <w:t>frontend</w:t>
+      </w:r>
+      <w:proofErr w:type="spellEnd"/>
+      <w:r>
+        <w:rPr>
+          <w:lang w:val="ru-RU"/>
+        </w:rPr>
+        <w:t xml:space="preserve"> и </w:t>
+      </w:r>
+      <w:proofErr w:type="spellStart"/>
+      <w:r>
+        <w:rPr>
+          <w:lang w:val="ru-RU"/>
+        </w:rPr>
+        <w:t>backend</w:t>
+      </w:r>
+      <w:proofErr w:type="spellEnd"/>
+      <w:r>
+        <w:rPr>
+          <w:lang w:val="ru-RU"/>
+        </w:rPr>
+        <w:t xml:space="preserve"> отделены друг от друга и взаимодействуют через REST API. Это позволяет независимо запускать и масштабировать клиентскую и серверную части. Оба компонента размещаются на </w:t>
+      </w:r>
+      <w:proofErr w:type="spellStart"/>
+      <w:r>
+        <w:rPr>
+          <w:lang w:val="ru-RU"/>
+        </w:rPr>
+        <w:t>helios</w:t>
+      </w:r>
+      <w:proofErr w:type="spellEnd"/>
+      <w:r>
+        <w:rPr>
+          <w:lang w:val="ru-RU"/>
+        </w:rPr>
+        <w:t xml:space="preserve"> отдельными процессами.</w:t>
+      </w:r>
+    </w:p>
+    <w:p>
+      <w:pPr>
+        <w:rPr>
+          <w:lang w:val="ru-RU"/>
+        </w:rPr>
+      </w:pPr>
+      <w:r>
+        <w:rPr>
+          <w:b/>
+          <w:lang w:val="ru-RU"/>
+        </w:rPr>
+        <w:t>Фронтенд (Client Side):</w:t>
+      </w:r>
+      <w:r>
+        <w:rPr>
+          <w:lang w:val="ru-RU"/>
+        </w:rPr>
+        <w:t xml:space="preserve"> Одностраничное приложение на </w:t>
+      </w:r>
+      <w:proofErr w:type="spellStart"/>
+      <w:r>
+        <w:rPr>
+          <w:lang w:val="ru-RU"/>
+        </w:rPr>
+        <w:t>React</w:t>
+      </w:r>
+      <w:proofErr w:type="spellEnd"/>
+      <w:r>
+        <w:rPr>
+          <w:lang w:val="ru-RU"/>
+        </w:rPr>
+        <w:t xml:space="preserve">. Код выполняется в браузере, а файлы раздаёт процесс Node.js на </w:t>
+      </w:r>
+      <w:proofErr w:type="spellStart"/>
+      <w:r>
+        <w:rPr>
+          <w:lang w:val="ru-RU"/>
+        </w:rPr>
+        <w:t>helios</w:t>
+      </w:r>
+      <w:proofErr w:type="spellEnd"/>
+      <w:r>
+        <w:rPr>
+          <w:lang w:val="ru-RU"/>
+        </w:rPr>
+        <w:t xml:space="preserve">. Интерфейс обеспечивает сценарии заявок, тендеров, журнала работ и приёмки. Фронтенд взаимодействует с бэкендом через </w:t>
+      </w:r>
+      <w:proofErr w:type="spellStart"/>
+      <w:r>
+        <w:rPr>
+          <w:lang w:val="ru-RU"/>
+        </w:rPr>
+        <w:t>RESTful</w:t>
+      </w:r>
+      <w:proofErr w:type="spellEnd"/>
+      <w:r>
+        <w:rPr>
+          <w:lang w:val="ru-RU"/>
+        </w:rPr>
+        <w:t xml:space="preserve"> API.</w:t>
+      </w:r>
+    </w:p>
+    <w:p>
+      <w:pPr>
+        <w:rPr>
+          <w:lang w:val="ru-RU"/>
+        </w:rPr>
+      </w:pPr>
+      <w:r>
+        <w:rPr>
+          <w:b/>
+          <w:lang w:val="ru-RU"/>
+        </w:rPr>
+        <w:t>Бэкенд (Server Side):</w:t>
+      </w:r>
+      <w:r>
+        <w:rPr>
+          <w:lang w:val="ru-RU"/>
+        </w:rPr>
+        <w:t xml:space="preserve"> Реализован как монолит на </w:t>
+      </w:r>
+      <w:proofErr w:type="spellStart"/>
+      <w:r>
+        <w:rPr>
+          <w:lang w:val="ru-RU"/>
+        </w:rPr>
+        <w:t>Jakarta</w:t>
+      </w:r>
+      <w:proofErr w:type="spellEnd"/>
+      <w:r>
+        <w:rPr>
+          <w:lang w:val="ru-RU"/>
+        </w:rPr>
+        <w:t xml:space="preserve"> EE с использованием MVC. Ресурсы JAX-RS выполняют роль контроллеров, сущности и DTO образуют модель, CDI-сервисы реализуют прикладную логику. </w:t>
+      </w:r>
+    </w:p>
+    <w:p>
+      <w:pPr>
+        <w:rPr>
+          <w:lang w:val="ru-RU"/>
+        </w:rPr>
+      </w:pPr>
+      <w:r>
+        <w:rPr>
+          <w:lang w:val="ru-RU"/>
+        </w:rPr>
+        <w:t>Основные модули бэкенда:</w:t>
+      </w:r>
+    </w:p>
+    <w:p>
+      <w:pPr>
+        <w:spacing w:after="60"/>
+        <w:ind w:left="490" w:hanging="288"/>
+        <w:rPr>
+          <w:lang w:val="ru-RU"/>
+        </w:rPr>
+      </w:pPr>
+      <w:r>
+        <w:rPr>
+          <w:lang w:val="ru-RU"/>
+        </w:rPr>
+        <w:t>•  модуль авторизации: вход в систему и разграничение ролей администратора, подрядчика и технического эксперта;</w:t>
+      </w:r>
+    </w:p>
+    <w:p>
+      <w:pPr>
+        <w:spacing w:after="60"/>
+        <w:ind w:left="490" w:hanging="288"/>
+        <w:rPr>
+          <w:lang w:val="ru-RU"/>
+        </w:rPr>
+      </w:pPr>
+      <w:r>
+        <w:rPr>
+          <w:lang w:val="ru-RU"/>
+        </w:rPr>
+        <w:lastRenderedPageBreak/>
+        <w:t>•  модуль объектов и заявок: структура зданий и дорог, заявки на ремонт, правила зависимостей работ;</w:t>
+      </w:r>
+    </w:p>
+    <w:p>
+      <w:pPr>
+        <w:spacing w:after="60"/>
+        <w:ind w:left="490" w:hanging="288"/>
+        <w:rPr>
+          <w:lang w:val="ru-RU"/>
+        </w:rPr>
+      </w:pPr>
+      <w:r>
+        <w:rPr>
+          <w:lang w:val="ru-RU"/>
+        </w:rPr>
+        <w:t>•  модуль планирования: граф работ, версии плана, критический путь и календарный график;</w:t>
+      </w:r>
+    </w:p>
+    <w:p>
+      <w:pPr>
+        <w:spacing w:after="60"/>
+        <w:ind w:left="490" w:hanging="288"/>
+        <w:rPr>
+          <w:lang w:val="ru-RU"/>
+        </w:rPr>
+      </w:pPr>
+      <w:r>
+        <w:rPr>
+          <w:lang w:val="ru-RU"/>
+        </w:rPr>
+        <w:t>•  модуль тендеров: лоты, предложения подрядчиков, рейтинг и выбор исполнителей;</w:t>
+      </w:r>
+    </w:p>
+    <w:p>
+      <w:pPr>
+        <w:spacing w:after="60"/>
+        <w:ind w:left="490" w:hanging="288"/>
+        <w:rPr>
+          <w:lang w:val="ru-RU"/>
+        </w:rPr>
+      </w:pPr>
+      <w:r>
+        <w:rPr>
+          <w:lang w:val="ru-RU"/>
+        </w:rPr>
+        <w:t>•  модуль выполнения: журнал работ, скрытые дефекты и перестроение плана;</w:t>
+      </w:r>
+    </w:p>
+    <w:p>
+      <w:pPr>
+        <w:spacing w:after="60"/>
+        <w:ind w:left="490" w:hanging="288"/>
+        <w:rPr>
+          <w:lang w:val="ru-RU"/>
+        </w:rPr>
+      </w:pPr>
+      <w:r>
+        <w:rPr>
+          <w:lang w:val="ru-RU"/>
+        </w:rPr>
+        <w:t>•  модуль приёмки: передача этапа, замечания, закрытие проекта и история подрядчиков.</w:t>
+      </w:r>
+    </w:p>
+    <w:p>
+      <w:pPr>
+        <w:rPr>
+          <w:lang w:val="ru-RU"/>
+        </w:rPr>
+      </w:pPr>
+      <w:r>
+        <w:rPr>
+          <w:b/>
+          <w:lang w:val="ru-RU"/>
+        </w:rPr>
+        <w:t>База данных:</w:t>
+      </w:r>
+      <w:r>
+        <w:rPr>
+          <w:lang w:val="ru-RU"/>
+        </w:rPr>
+        <w:t xml:space="preserve"> </w:t>
+      </w:r>
+      <w:proofErr w:type="spellStart"/>
+      <w:r>
+        <w:rPr>
+          <w:lang w:val="ru-RU"/>
+        </w:rPr>
+        <w:t>PostgreSQL</w:t>
+      </w:r>
+      <w:proofErr w:type="spellEnd"/>
+      <w:r>
+        <w:rPr>
+          <w:lang w:val="ru-RU"/>
+        </w:rPr>
+        <w:t xml:space="preserve"> хранит объекты ремонта, заявки, планы, тендеры, предложения, журналы выполнения, приёмки и показатели подрядчиков. Критически важные запросы реализуются процедурами PL/</w:t>
+      </w:r>
+      <w:proofErr w:type="spellStart"/>
+      <w:r>
+        <w:rPr>
+          <w:lang w:val="ru-RU"/>
+        </w:rPr>
+        <w:t>pgSQL</w:t>
+      </w:r>
+      <w:proofErr w:type="spellEnd"/>
+      <w:r>
+        <w:rPr>
+          <w:lang w:val="ru-RU"/>
+        </w:rPr>
+        <w:t xml:space="preserve"> и вызываются с уровня хранения.</w:t>
+      </w:r>
+    </w:p>
+    <w:p>
+      <w:pPr>
+        <w:rPr>
+          <w:lang w:val="ru-RU"/>
+        </w:rPr>
+      </w:pPr>
+      <w:r>
+        <w:rPr>
+          <w:lang w:val="ru-RU"/>
+        </w:rPr>
+        <w:t>Общая схема архитектуры:</w:t>
+      </w:r>
+    </w:p>
+    <w:p>
+      <w:pPr>
+        <w:pStyle w:val="21"/>
+        <w:rPr>
+          <w:lang w:val="ru-RU"/>
+        </w:rPr>
+      </w:pPr>
+      <w:r>
+        <w:rPr>
+          <w:lang w:val="ru-RU"/>
+        </w:rPr>
+        <w:t>Технологии и фреймворки:</w:t>
+      </w:r>
+    </w:p>
+    <w:tbl>
+      <w:tblPr>
+        <w:tblW w:w="0" w:type="auto"/>
+        <w:jc w:val="center"/>
+        <w:tblLayout w:type="fixed"/>
+        <w:tblLook w:val="04A0" w:firstRow="1" w:lastRow="0" w:firstColumn="1" w:lastColumn="0" w:noHBand="0" w:noVBand="1"/>
+      </w:tblPr>
+      <w:tblGrid>
+        <w:gridCol w:w="4968"/>
+        <w:gridCol w:w="4968"/>
+      </w:tblGrid>
+      <w:tr>
+        <w:trPr>
+          <w:tblHeader/>
+          <w:jc w:val="center"/>
+        </w:trPr>
+        <w:tc>
+          <w:tcPr>
+            <w:tcW w:w="4968" w:type="dxa"/>
+            <w:tcBorders>
+              <w:top w:val="single" w:sz="6" w:space="0" w:color="D9D9D9"/>
+              <w:left w:val="single" w:sz="6" w:space="0" w:color="D9D9D9"/>
+              <w:bottom w:val="single" w:sz="6" w:space="0" w:color="D9D9D9"/>
+              <w:right w:val="single" w:sz="6" w:space="0" w:color="D9D9D9"/>
+            </w:tcBorders>
+            <w:shd w:val="clear" w:color="auto" w:fill="1F4E78"/>
+            <w:tcMar>
+              <w:top w:w="90" w:type="dxa"/>
+              <w:left w:w="80" w:type="dxa"/>
+              <w:bottom w:w="90" w:type="dxa"/>
+              <w:right w:w="80" w:type="dxa"/>
+            </w:tcMar>
+            <w:vAlign w:val="center"/>
+          </w:tcPr>
+          <w:p>
+            <w:pPr>
+              <w:spacing w:after="0"/>
+              <w:jc w:val="center"/>
+            </w:pPr>
+            <w:r>
+              <w:rPr>
+                <w:b/>
+                <w:color w:val="FFFFFF"/>
+                <w:sz w:val="22"/>
+              </w:rPr>
+              <w:t>Backend</w:t>
+            </w:r>
+          </w:p>
+        </w:tc>
+        <w:tc>
+          <w:tcPr>
+            <w:tcW w:w="4968" w:type="dxa"/>
+            <w:tcBorders>
+              <w:top w:val="single" w:sz="6" w:space="0" w:color="D9D9D9"/>
+              <w:left w:val="single" w:sz="6" w:space="0" w:color="D9D9D9"/>
+              <w:bottom w:val="single" w:sz="6" w:space="0" w:color="D9D9D9"/>
+              <w:right w:val="single" w:sz="6" w:space="0" w:color="D9D9D9"/>
+            </w:tcBorders>
+            <w:shd w:val="clear" w:color="auto" w:fill="1F4E78"/>
+            <w:tcMar>
+              <w:top w:w="90" w:type="dxa"/>
+              <w:left w:w="80" w:type="dxa"/>
+              <w:bottom w:w="90" w:type="dxa"/>
+              <w:right w:w="80" w:type="dxa"/>
+            </w:tcMar>
+            <w:vAlign w:val="center"/>
+          </w:tcPr>
+          <w:p>
+            <w:pPr>
+              <w:spacing w:after="0"/>
+              <w:jc w:val="center"/>
+            </w:pPr>
+            <w:r>
+              <w:rPr>
+                <w:b/>
+                <w:color w:val="FFFFFF"/>
+                <w:sz w:val="22"/>
+              </w:rPr>
+              <w:t>Frontend</w:t>
+            </w:r>
+          </w:p>
+        </w:tc>
+      </w:tr>
+      <w:tr>
+        <w:trPr>
+          <w:cantSplit/>
+          <w:jc w:val="center"/>
+        </w:trPr>
+        <w:tc>
+          <w:tcPr>
+            <w:tcW w:w="4968" w:type="dxa"/>
+            <w:tcBorders>
+              <w:top w:val="single" w:sz="6" w:space="0" w:color="D9D9D9"/>
+              <w:left w:val="single" w:sz="6" w:space="0" w:color="D9D9D9"/>
+              <w:bottom w:val="single" w:sz="6" w:space="0" w:color="D9D9D9"/>
+              <w:right w:val="single" w:sz="6" w:space="0" w:color="D9D9D9"/>
+            </w:tcBorders>
+            <w:tcMar>
+              <w:top w:w="80" w:type="dxa"/>
+              <w:left w:w="80" w:type="dxa"/>
+              <w:bottom w:w="80" w:type="dxa"/>
+              <w:right w:w="80" w:type="dxa"/>
+            </w:tcMar>
+          </w:tcPr>
+          <w:p>
+            <w:pPr>
+              <w:spacing w:after="40"/>
+              <w:ind w:left="220" w:hanging="220"/>
+            </w:pPr>
+            <w:r>
+              <w:rPr>
+                <w:sz w:val="21"/>
+              </w:rPr>
+              <w:t>•  Java</w:t>
+            </w:r>
+          </w:p>
+          <w:p>
+            <w:pPr>
+              <w:spacing w:after="40"/>
+              <w:ind w:left="220" w:hanging="220"/>
+            </w:pPr>
+            <w:r>
+              <w:rPr>
+                <w:sz w:val="21"/>
+              </w:rPr>
+              <w:t>•  Jakarta EE (JAX-RS, CDI, Bean Validation, JPA)</w:t>
+            </w:r>
+          </w:p>
+          <w:p>
+            <w:pPr>
+              <w:spacing w:after="40"/>
+              <w:ind w:left="220" w:hanging="220"/>
+              <w:rPr>
+                <w:lang w:val="ru-RU"/>
+              </w:rPr>
+            </w:pPr>
+            <w:r>
+              <w:rPr>
+                <w:sz w:val="21"/>
+                <w:lang w:val="ru-RU"/>
+              </w:rPr>
+              <w:t xml:space="preserve">•  </w:t>
+            </w:r>
+            <w:proofErr w:type="spellStart"/>
+            <w:r>
+              <w:rPr>
+                <w:sz w:val="21"/>
+                <w:lang w:val="ru-RU"/>
+              </w:rPr>
+              <w:t>WildFly</w:t>
+            </w:r>
+            <w:proofErr w:type="spellEnd"/>
+          </w:p>
+          <w:p>
+            <w:pPr>
+              <w:spacing w:after="40"/>
+              <w:ind w:left="220" w:hanging="220"/>
+              <w:rPr>
+                <w:lang w:val="ru-RU"/>
+              </w:rPr>
+            </w:pPr>
+            <w:r>
+              <w:rPr>
+                <w:sz w:val="21"/>
+                <w:lang w:val="ru-RU"/>
+              </w:rPr>
+              <w:t xml:space="preserve">•  </w:t>
+            </w:r>
+            <w:proofErr w:type="spellStart"/>
+            <w:r>
+              <w:rPr>
+                <w:sz w:val="21"/>
+                <w:lang w:val="ru-RU"/>
+              </w:rPr>
+              <w:t>PostgreSQL</w:t>
+            </w:r>
+            <w:proofErr w:type="spellEnd"/>
+          </w:p>
+        </w:tc>
+        <w:tc>
+          <w:tcPr>
+            <w:tcW w:w="4968" w:type="dxa"/>
+            <w:tcBorders>
+              <w:top w:val="single" w:sz="6" w:space="0" w:color="D9D9D9"/>
+              <w:left w:val="single" w:sz="6" w:space="0" w:color="D9D9D9"/>
+              <w:bottom w:val="single" w:sz="6" w:space="0" w:color="D9D9D9"/>
+              <w:right w:val="single" w:sz="6" w:space="0" w:color="D9D9D9"/>
+            </w:tcBorders>
+            <w:tcMar>
+              <w:top w:w="80" w:type="dxa"/>
+              <w:left w:w="80" w:type="dxa"/>
+              <w:bottom w:w="80" w:type="dxa"/>
+              <w:right w:w="80" w:type="dxa"/>
+            </w:tcMar>
+          </w:tcPr>
+          <w:p>
+            <w:pPr>
+              <w:spacing w:after="40"/>
+              <w:ind w:left="220" w:hanging="220"/>
+              <w:rPr>
+                <w:lang w:val="ru-RU"/>
+              </w:rPr>
+            </w:pPr>
+            <w:r>
+              <w:rPr>
+                <w:sz w:val="21"/>
+                <w:lang w:val="ru-RU"/>
+              </w:rPr>
+              <w:t xml:space="preserve">•  </w:t>
+            </w:r>
+            <w:proofErr w:type="spellStart"/>
+            <w:r>
+              <w:rPr>
+                <w:sz w:val="21"/>
+                <w:lang w:val="ru-RU"/>
+              </w:rPr>
+              <w:t>React</w:t>
+            </w:r>
+            <w:proofErr w:type="spellEnd"/>
+          </w:p>
+          <w:p>
+            <w:pPr>
+              <w:spacing w:after="40"/>
+              <w:ind w:left="220" w:hanging="220"/>
+              <w:rPr>
+                <w:lang w:val="ru-RU"/>
+              </w:rPr>
+            </w:pPr>
+            <w:r>
+              <w:rPr>
+                <w:sz w:val="21"/>
+                <w:lang w:val="ru-RU"/>
+              </w:rPr>
+              <w:t>•  Node.js</w:t>
+            </w:r>
+          </w:p>
+        </w:tc>
+      </w:tr>
+    </w:tbl>
+    <w:p>
+      <w:pPr>
+        <w:pStyle w:val="1"/>
+        <w:rPr>
+          <w:lang w:val="ru-RU"/>
+        </w:rPr>
+      </w:pPr>
+      <w:r>
+        <w:rPr>
+          <w:lang w:val="ru-RU"/>
+        </w:rPr>
+        <w:t>7. ВЫВОД</w:t>
+      </w:r>
+    </w:p>
+    <w:p>
+      <w:pPr>
+        <w:rPr>
+          <w:lang w:val="ru-RU"/>
+        </w:rPr>
+      </w:pPr>
+      <w:r>
+        <w:rPr>
+          <w:lang w:val="ru-RU"/>
+        </w:rPr>
+        <w:t>В результате выполнения первого этапа курсовой работы выбрана и подробно описана предметная область комплексного ремонта зданий и автомобильных дорог. Сформулировано назначение информационной системы «РемКомСтрой»: она нужна, чтобы учитывать структуру объекта, зависимые работы, тендеры, выполнение и приёмку в одном контуре, а не разрозненными таблицами и перепиской.</w:t>
+      </w:r>
+    </w:p>
+    <w:p>
+      <w:pPr>
+        <w:rPr>
+          <w:lang w:val="ru-RU"/>
+        </w:rPr>
+      </w:pPr>
+      <w:r>
+        <w:rPr>
+          <w:lang w:val="ru-RU"/>
+        </w:rPr>
+        <w:t>Составлены функциональные и нефункциональные требования, построены модели основных прецедентов и подготовлены их спецификации. Для реализации предложена клиент-серверная многослойная архитектура: frontend на React, backend на Jakarta EE, база данных PostgreSQL. Базовое проектирование системы на этом этапе завершено; следующий шаг — построение ER-модели и реализация базы данных на сервере helios.</w:t>
+      </w:r>
+    </w:p>
+    <w:p/>
     <w:p>
       <w:pPr>
         <w:rPr>

</xml_diff>